<commit_message>
Roteiro Elvis: revisão da parte 2
Co-Authored-By: Claude Opus 5.5 <noreply@anthropic.com>
Claude-Session: https://claude.ai/code/session_01MJjUEEZrxQDEUifKK2vj9g
</commit_message>
<xml_diff>
--- a/roteiros/elvis/Elvis_Parte2.docx
+++ b/roteiros/elvis/Elvis_Parte2.docx
@@ -135,7 +135,7 @@
         <w:rPr>
           <w:color w:val="000000"/>
         </w:rPr>
-        <w:t>Ele decidia os contratos, os shows, os filmes, as entrevistas. Fechava acordos para vender tudo o que tivesse o rosto de Elvis. De batom a boneco. Até broches com a frase "Eu odeio Elvis" ele vendia, para ganhar também com quem não gostava do cantor.</w:t>
+        <w:t>Ele decidia os contratos e os shows, até as entrevistas. Fechava acordos para vender tudo o que tivesse o rosto de Elvis. De batom a boneco. Até broches com a frase "Eu odeio Elvis" ele vendia, para ganhar também com quem não gostava do cantor.</w:t>
       </w:r>
     </w:p>
     <w:p>
@@ -175,7 +175,7 @@
         <w:rPr>
           <w:color w:val="000000"/>
         </w:rPr>
-        <w:t>A mulher que tinha perdido a casa de dois cômodos em Tupelo agora morava numa mansão com colunas brancas. Elvis tinha cumprido a promessa silenciosa que fez quando era criança.</w:t>
+        <w:t>A mulher que tinha perdido a casa de dois cômodos em Tupelo agora morava numa mansão com colunas brancas. Elvis tinha dado à mãe tudo o que faltou na infância dele.</w:t>
       </w:r>
     </w:p>
     <w:p>
@@ -239,7 +239,7 @@
         <w:rPr>
           <w:color w:val="000000"/>
         </w:rPr>
-        <w:t>Em março de mil novecentos e cinquenta e oito, Elvis entrou no quartel e teve o famoso topete raspado diante dos fotógrafos. Foi mandado para a Alemanha, onde serviria por quase dois anos.</w:t>
+        <w:t>Em março de mil novecentos e cinquenta e oito, Elvis entrou no quartel e teve o famoso topete raspado diante dos fotógrafos. Depois do treinamento, seria mandado para a Alemanha, onde serviria por quase dois anos.</w:t>
       </w:r>
     </w:p>
     <w:p>
@@ -271,7 +271,7 @@
         <w:rPr>
           <w:color w:val="C00000"/>
         </w:rPr>
-        <w:t>Guarde isso. O Coronel acompanhava cada centavo, cada foto, cada contrato de Elvis. Mas, durante dois anos, não pôs os pés na Europa. E a razão disso é o segredo que vai explicar tudo o que aconteceu com Elvis Presley pelo resto da vida.</w:t>
+        <w:t>Guarde isso. O Coronel acompanhava cada centavo que Elvis ganhava. Mas, durante dois anos, não pôs os pés na Europa. E a razão disso é o segredo que vai explicar tudo o que aconteceu com Elvis Presley pelo resto da vida.</w:t>
       </w:r>
     </w:p>
     <w:p>
@@ -327,7 +327,7 @@
         <w:rPr>
           <w:color w:val="000000"/>
         </w:rPr>
-        <w:t>A mulher que tinha perdido um filho no parto, que tinha segurado a família quando o marido foi preso, que tinha desconfiado do Coronel desde o primeiro dia, não estava mais lá.</w:t>
+        <w:t>A mulher que tinha segurado a família quando o marido foi preso, e que tinha desconfiado do Coronel desde o primeiro dia, não estava mais lá.</w:t>
       </w:r>
     </w:p>
     <w:p>
@@ -335,7 +335,7 @@
         <w:rPr>
           <w:color w:val="C00000"/>
         </w:rPr>
-        <w:t>Imagine por um momento que fosse você. Vinte e três anos, o homem mais famoso do país, e a única pessoa em quem você confiava de verdade acaba de morrer. Agora imagine quem estava ao seu lado, pronto para decidir tudo por você.</w:t>
+        <w:t>Imagine por um momento que fosse você. Vinte e três anos, um dos homens mais famosos do mundo, e a única pessoa em quem você confiava de verdade acaba de morrer. Agora imagine quem estava ao seu lado, pronto para decidir tudo por você.</w:t>
       </w:r>
     </w:p>
     <w:p>

</xml_diff>

<commit_message>
Roteiro Elvis: parte 5 final, acréscimos verificados e roteiro completo
Co-Authored-By: Claude Opus 5.5 <noreply@anthropic.com>
Claude-Session: https://claude.ai/code/session_01MJjUEEZrxQDEUifKK2vj9g
</commit_message>
<xml_diff>
--- a/roteiros/elvis/Elvis_Parte2.docx
+++ b/roteiros/elvis/Elvis_Parte2.docx
@@ -112,6 +112,22 @@
           <w:color w:val="000000"/>
         </w:rPr>
         <w:t>"Heartbreak Hotel" chegou ao topo das paradas. Elvis apareceu nos maiores programas de televisão dos Estados Unidos. Em setembro de mil novecentos e cinquenta e seis, quando se apresentou no programa de Ed Sullivan, cerca de sessenta milhões de pessoas estavam diante da televisão.</w:t>
+      </w:r>
+    </w:p>
+    <w:p>
+      <w:r>
+        <w:rPr>
+          <w:color w:val="000000"/>
+        </w:rPr>
+        <w:t>Nem tudo era glória. Em julho de mil novecentos e cinquenta e seis, num programa de televisão apresentado por Steve Allen, Elvis foi colocado de smoking para cantar "Hound Dog" para um cachorro de verdade, sentado num banquinho. A plateia riu. Anos depois, Elvis diria que aquela foi uma das apresentações mais humilhantes da vida dele. Mas era audiência, e o Coronel queria audiência.</w:t>
+      </w:r>
+    </w:p>
+    <w:p>
+      <w:r>
+        <w:rPr>
+          <w:color w:val="000000"/>
+        </w:rPr>
+        <w:t>E, na última aparição no programa de Ed Sullivan, em janeiro de mil novecentos e cinquenta e sete, as câmeras filmaram Elvis só da cintura para cima. O rebolado era considerado indecente demais para as famílias americanas.</w:t>
       </w:r>
     </w:p>
     <w:p>

</xml_diff>